<commit_message>
Refresh capstone report: new CI run evidence (36202768375), updated figures, regenerated docx+pdf
Co-authored-by: arena-agent <297053741+arena-agent@users.noreply.github.com>
</commit_message>
<xml_diff>
--- a/docs/Capstone_Report.docx
+++ b/docs/Capstone_Report.docx
@@ -550,7 +550,7 @@
               <w:rPr>
                 <w:sz w:val="19"/>
               </w:rPr>
-              <w:t>PostgreSQL 16 (bundled server used for the development/test database in this workspace)</w:t>
+              <w:t>PostgreSQL (postgres:16-alpine in docker-compose and CI; an embedded PostgreSQL 18 server for the development/test database in this workspace)</w:t>
             </w:r>
           </w:p>
         </w:tc>
@@ -2055,7 +2055,7 @@
       <w:r>
         <w:drawing>
           <wp:inline xmlns:a="http://schemas.openxmlformats.org/drawingml/2006/main" xmlns:pic="http://schemas.openxmlformats.org/drawingml/2006/picture">
-            <wp:extent cx="5760720" cy="902579"/>
+            <wp:extent cx="5760720" cy="926186"/>
             <wp:docPr id="2" name="Picture 2"/>
             <wp:cNvGraphicFramePr>
               <a:graphicFrameLocks noChangeAspect="1"/>
@@ -2076,7 +2076,7 @@
                   <pic:spPr>
                     <a:xfrm>
                       <a:off x="0" y="0"/>
-                      <a:ext cx="5760720" cy="902579"/>
+                      <a:ext cx="5760720" cy="926186"/>
                     </a:xfrm>
                     <a:prstGeom prst="rect"/>
                   </pic:spPr>
@@ -2108,7 +2108,7 @@
       <w:r>
         <w:drawing>
           <wp:inline xmlns:a="http://schemas.openxmlformats.org/drawingml/2006/main" xmlns:pic="http://schemas.openxmlformats.org/drawingml/2006/picture">
-            <wp:extent cx="5760720" cy="4291004"/>
+            <wp:extent cx="5760720" cy="8729602"/>
             <wp:docPr id="3" name="Picture 3"/>
             <wp:cNvGraphicFramePr>
               <a:graphicFrameLocks noChangeAspect="1"/>
@@ -2129,7 +2129,7 @@
                   <pic:spPr>
                     <a:xfrm>
                       <a:off x="0" y="0"/>
-                      <a:ext cx="5760720" cy="4291004"/>
+                      <a:ext cx="5760720" cy="8729602"/>
                     </a:xfrm>
                     <a:prstGeom prst="rect"/>
                   </pic:spPr>
@@ -2151,7 +2151,7 @@
           <w:color w:val="444444"/>
           <w:sz w:val="18"/>
         </w:rPr>
-        <w:t>Figure 3: All 8 unit/integration tests pass against a real PostgreSQL 16 server (node:test + supertest), including the 503 path when the database is unreachable.</w:t>
+        <w:t>Figure 3: All 8 unit/integration tests pass against a real PostgreSQL server (node:test + supertest), including the 503 path when the database is unreachable.</w:t>
       </w:r>
     </w:p>
     <w:p>
@@ -2161,7 +2161,7 @@
       <w:r>
         <w:drawing>
           <wp:inline xmlns:a="http://schemas.openxmlformats.org/drawingml/2006/main" xmlns:pic="http://schemas.openxmlformats.org/drawingml/2006/picture">
-            <wp:extent cx="5760720" cy="3068752"/>
+            <wp:extent cx="5760720" cy="3200400"/>
             <wp:docPr id="4" name="Picture 4"/>
             <wp:cNvGraphicFramePr>
               <a:graphicFrameLocks noChangeAspect="1"/>
@@ -2182,7 +2182,7 @@
                   <pic:spPr>
                     <a:xfrm>
                       <a:off x="0" y="0"/>
-                      <a:ext cx="5760720" cy="3068752"/>
+                      <a:ext cx="5760720" cy="3200400"/>
                     </a:xfrm>
                     <a:prstGeom prst="rect"/>
                   </pic:spPr>
@@ -2222,7 +2222,7 @@
       <w:r>
         <w:drawing>
           <wp:inline xmlns:a="http://schemas.openxmlformats.org/drawingml/2006/main" xmlns:pic="http://schemas.openxmlformats.org/drawingml/2006/picture">
-            <wp:extent cx="5760720" cy="7676420"/>
+            <wp:extent cx="5760720" cy="7575259"/>
             <wp:docPr id="5" name="Picture 5"/>
             <wp:cNvGraphicFramePr>
               <a:graphicFrameLocks noChangeAspect="1"/>
@@ -2243,7 +2243,7 @@
                   <pic:spPr>
                     <a:xfrm>
                       <a:off x="0" y="0"/>
-                      <a:ext cx="5760720" cy="7676420"/>
+                      <a:ext cx="5760720" cy="7575259"/>
                     </a:xfrm>
                     <a:prstGeom prst="rect"/>
                   </pic:spPr>
@@ -2265,7 +2265,7 @@
           <w:color w:val="444444"/>
           <w:sz w:val="18"/>
         </w:rPr>
-        <w:t>Figure 5: A successful CI/CD Deploy run on GitHub Actions — lint &amp; tests, terraform fmt/validate and the docker build + compose integration test all pass; the AWS stages are cleanly skipped because no credentials are attached to this repository yet (https://github.com/SUB-Bzero/Automated-Cloud-Deployment-Pipeline/actions/runs/35932827444).</w:t>
+        <w:t>Figure 5: A successful CI/CD Deploy run on GitHub Actions — lint &amp; tests, terraform fmt/validate and the docker build + compose integration test all pass; the AWS stages are cleanly skipped because no credentials are attached to this repository yet (https://github.com/SUB-Bzero/Automated-Cloud-Deployment-Pipeline/actions/runs/36202768375).</w:t>
       </w:r>
     </w:p>
     <w:p>
@@ -2283,7 +2283,7 @@
       <w:r>
         <w:drawing>
           <wp:inline xmlns:a="http://schemas.openxmlformats.org/drawingml/2006/main" xmlns:pic="http://schemas.openxmlformats.org/drawingml/2006/picture">
-            <wp:extent cx="5760720" cy="6776711"/>
+            <wp:extent cx="5760720" cy="5309881"/>
             <wp:docPr id="6" name="Picture 6"/>
             <wp:cNvGraphicFramePr>
               <a:graphicFrameLocks noChangeAspect="1"/>
@@ -2304,7 +2304,7 @@
                   <pic:spPr>
                     <a:xfrm>
                       <a:off x="0" y="0"/>
-                      <a:ext cx="5760720" cy="6776711"/>
+                      <a:ext cx="5760720" cy="5309881"/>
                     </a:xfrm>
                     <a:prstGeom prst="rect"/>
                   </pic:spPr>
@@ -2704,7 +2704,7 @@
     </w:p>
     <w:p>
       <w:r>
-        <w:t>The repository contains the application, the modular Terraform codebase, the CI/CD workflows, the deploy/rollback script, the architecture diagram and this report (docs/Capstone_Report.docx / .pdf). Work is delivered on the branch arena/01a0d06d-automated-cloud-deployment-pip and merged to main via pull request; the pipeline runs on every push.</w:t>
+        <w:t>The repository contains the application, the modular Terraform codebase, the CI/CD workflows, the deploy/rollback script, the architecture diagram and this report (docs/Capstone_Report.docx / .pdf). All work is merged into the main branch through pull requests (the capstone delivery was merged via pull request #1), so the assessor always sees the latest version on main; the pipeline runs on every push.</w:t>
       </w:r>
     </w:p>
     <w:p>

</xml_diff>

<commit_message>
Refresh capstone report: new CI run evidence (36204047142), updated Figure 5, regenerate docx+pdf
Co-authored-by: arena-agent <297053741+arena-agent@users.noreply.github.com>
</commit_message>
<xml_diff>
--- a/docs/Capstone_Report.docx
+++ b/docs/Capstone_Report.docx
@@ -2055,7 +2055,7 @@
       <w:r>
         <w:drawing>
           <wp:inline xmlns:a="http://schemas.openxmlformats.org/drawingml/2006/main" xmlns:pic="http://schemas.openxmlformats.org/drawingml/2006/picture">
-            <wp:extent cx="5760720" cy="926186"/>
+            <wp:extent cx="5760720" cy="1357333"/>
             <wp:docPr id="2" name="Picture 2"/>
             <wp:cNvGraphicFramePr>
               <a:graphicFrameLocks noChangeAspect="1"/>
@@ -2076,7 +2076,7 @@
                   <pic:spPr>
                     <a:xfrm>
                       <a:off x="0" y="0"/>
-                      <a:ext cx="5760720" cy="926186"/>
+                      <a:ext cx="5760720" cy="1357333"/>
                     </a:xfrm>
                     <a:prstGeom prst="rect"/>
                   </pic:spPr>
@@ -2108,7 +2108,7 @@
       <w:r>
         <w:drawing>
           <wp:inline xmlns:a="http://schemas.openxmlformats.org/drawingml/2006/main" xmlns:pic="http://schemas.openxmlformats.org/drawingml/2006/picture">
-            <wp:extent cx="5760720" cy="8729602"/>
+            <wp:extent cx="5760720" cy="8861249"/>
             <wp:docPr id="3" name="Picture 3"/>
             <wp:cNvGraphicFramePr>
               <a:graphicFrameLocks noChangeAspect="1"/>
@@ -2129,7 +2129,7 @@
                   <pic:spPr>
                     <a:xfrm>
                       <a:off x="0" y="0"/>
-                      <a:ext cx="5760720" cy="8729602"/>
+                      <a:ext cx="5760720" cy="8861249"/>
                     </a:xfrm>
                     <a:prstGeom prst="rect"/>
                   </pic:spPr>
@@ -2161,7 +2161,7 @@
       <w:r>
         <w:drawing>
           <wp:inline xmlns:a="http://schemas.openxmlformats.org/drawingml/2006/main" xmlns:pic="http://schemas.openxmlformats.org/drawingml/2006/picture">
-            <wp:extent cx="5760720" cy="3200400"/>
+            <wp:extent cx="5760720" cy="3068752"/>
             <wp:docPr id="4" name="Picture 4"/>
             <wp:cNvGraphicFramePr>
               <a:graphicFrameLocks noChangeAspect="1"/>
@@ -2182,7 +2182,7 @@
                   <pic:spPr>
                     <a:xfrm>
                       <a:off x="0" y="0"/>
-                      <a:ext cx="5760720" cy="3200400"/>
+                      <a:ext cx="5760720" cy="3068752"/>
                     </a:xfrm>
                     <a:prstGeom prst="rect"/>
                   </pic:spPr>
@@ -2222,7 +2222,7 @@
       <w:r>
         <w:drawing>
           <wp:inline xmlns:a="http://schemas.openxmlformats.org/drawingml/2006/main" xmlns:pic="http://schemas.openxmlformats.org/drawingml/2006/picture">
-            <wp:extent cx="5760720" cy="7575259"/>
+            <wp:extent cx="5760720" cy="7939716"/>
             <wp:docPr id="5" name="Picture 5"/>
             <wp:cNvGraphicFramePr>
               <a:graphicFrameLocks noChangeAspect="1"/>
@@ -2243,7 +2243,7 @@
                   <pic:spPr>
                     <a:xfrm>
                       <a:off x="0" y="0"/>
-                      <a:ext cx="5760720" cy="7575259"/>
+                      <a:ext cx="5760720" cy="7939716"/>
                     </a:xfrm>
                     <a:prstGeom prst="rect"/>
                   </pic:spPr>
@@ -2265,7 +2265,7 @@
           <w:color w:val="444444"/>
           <w:sz w:val="18"/>
         </w:rPr>
-        <w:t>Figure 5: A successful CI/CD Deploy run on GitHub Actions — lint &amp; tests, terraform fmt/validate and the docker build + compose integration test all pass; the AWS stages are cleanly skipped because no credentials are attached to this repository yet (https://github.com/SUB-Bzero/Automated-Cloud-Deployment-Pipeline/actions/runs/36202768375).</w:t>
+        <w:t>Figure 5: A successful CI/CD Deploy run on GitHub Actions — lint &amp; tests, terraform fmt/validate and the docker build + compose integration test all pass; the AWS stages are cleanly skipped because no credentials are attached to this repository yet (https://github.com/SUB-Bzero/Automated-Cloud-Deployment-Pipeline/actions/runs/36204047142).</w:t>
       </w:r>
     </w:p>
     <w:p>
@@ -2704,7 +2704,7 @@
     </w:p>
     <w:p>
       <w:r>
-        <w:t>The repository contains the application, the modular Terraform codebase, the CI/CD workflows, the deploy/rollback script, the architecture diagram and this report (docs/Capstone_Report.docx / .pdf). All work is merged into the main branch through pull requests (the capstone delivery was merged via pull request #1), so the assessor always sees the latest version on main; the pipeline runs on every push.</w:t>
+        <w:t>The repository contains the application, the modular Terraform codebase, the CI/CD workflows, the deploy/rollback script, the architecture diagram and this report (docs/Capstone_Report.docx / .pdf). All work is merged into the main branch through pull requests (the capstone delivery was merged via pull requests #1, #2 and #3), so the assessor always sees the latest version on main; the pipeline runs on every push.</w:t>
       </w:r>
     </w:p>
     <w:p>

</xml_diff>